<commit_message>
Actualizar informes y cronogramas completos
</commit_message>
<xml_diff>
--- a/juliano/cronogramas/Cronograma_Informatica_Semana8_IUTECP.docx
+++ b/juliano/cronogramas/Cronograma_Informatica_Semana8_IUTECP.docx
@@ -181,7 +181,7 @@
           <w:b w:val="0"/>
           <w:sz w:val="24"/>
         </w:rPr>
-        <w:t>Redactar el informe técnico de pasantías, elaborar los manuales de usuario del sistema y estructurar definitivamente el código fuente para la entrega institucional, participando en las actividades regulares de cierre administrativo del período.</w:t>
+        <w:t>Redactar el informe técnico de pasantías, diseñar y elaborar el manual de usuario del sistema y estructurar definitivamente el código fuente para la entrega institucional, participando en las actividades regulares de cierre administrativo del período.</w:t>
       </w:r>
     </w:p>
     <w:p/>
@@ -514,7 +514,7 @@
                 <w:b w:val="0"/>
                 <w:sz w:val="20"/>
               </w:rPr>
-              <w:t>Elaboración del manual de usuario del sistema</w:t>
+              <w:t>Diseño y elaboración del manual de usuario del sistema</w:t>
             </w:r>
           </w:p>
         </w:tc>
@@ -535,7 +535,7 @@
                 <w:b w:val="0"/>
                 <w:sz w:val="20"/>
               </w:rPr>
-              <w:t>Redacción del manual de usuario que describe paso a paso el uso de los módulos de registro, consulta, historial y generación de reportes, con capturas de pantalla de la interfaz.</w:t>
+              <w:t>Estructuración y desarrollo del manual de usuario, organizando las instrucciones de uso de los módulos de registro, consulta, historial y generación de reportes, e incorporando capturas de pantalla de la interfaz para facilitar la comprensión de cada procedimiento.</w:t>
             </w:r>
           </w:p>
         </w:tc>
@@ -622,8 +622,6 @@
                 <w:sz w:val="20"/>
               </w:rPr>
               <w:t>Revisión integral del código fuente, incorporación de comentarios explicativos en las funciones críticas, organización de los archivos del proyecto y sincronización de la versión final en el repositorio.</w:t>
-              <w:br/>
-              <w:br/>
             </w:r>
           </w:p>
         </w:tc>
@@ -688,7 +686,7 @@
                 <w:b w:val="0"/>
                 <w:sz w:val="20"/>
               </w:rPr>
-              <w:t>Revisión preliminar del informe con el tutor académico</w:t>
+              <w:t>Revisión preliminar del informe y apoyo en el control documental</w:t>
             </w:r>
           </w:p>
         </w:tc>
@@ -709,7 +707,7 @@
                 <w:b w:val="0"/>
                 <w:sz w:val="20"/>
               </w:rPr>
-              <w:t>Envío de la versión preliminar del informe al tutor académico para su revisión, recepción de observaciones iniciales e incorporación de las correcciones formales indicadas.</w:t>
+              <w:t>Envío de la versión preliminar del informe al tutor académico para su revisión y recepción de observaciones iniciales, participando paralelamente en el registro y actualización de expedientes recibidos por el Departamento de Presidencia en la hoja de cálculo institucional.</w:t>
             </w:r>
           </w:p>
         </w:tc>
@@ -730,7 +728,7 @@
                 <w:b w:val="0"/>
                 <w:sz w:val="20"/>
               </w:rPr>
-              <w:t>Informe preliminar, medios de comunicación institucional</w:t>
+              <w:t>Informe preliminar, medios de comunicación institucional, expedientes físicos, hoja de cálculo</w:t>
             </w:r>
           </w:p>
         </w:tc>

</xml_diff>

<commit_message>
Recompilar cronogramas de Juliano
</commit_message>
<xml_diff>
--- a/juliano/cronogramas/Cronograma_Informatica_Semana8_IUTECP.docx
+++ b/juliano/cronogramas/Cronograma_Informatica_Semana8_IUTECP.docx
@@ -707,7 +707,7 @@
                 <w:b w:val="0"/>
                 <w:sz w:val="20"/>
               </w:rPr>
-              <w:t>Envío de la versión preliminar del informe al tutor académico para su revisión y recepción de observaciones iniciales, participando paralelamente en el registro y actualización de expedientes recibidos por el Departamento de Presidencia en la hoja de cálculo institucional.</w:t>
+              <w:t>Envío de la versión preliminar del informe al tutor académico para su revisión y recepción de observaciones iniciales, participando paralelamente en el registro de expedientes recibidos por el departamento en la hoja de cálculo.</w:t>
             </w:r>
           </w:p>
         </w:tc>
@@ -728,7 +728,7 @@
                 <w:b w:val="0"/>
                 <w:sz w:val="20"/>
               </w:rPr>
-              <w:t>Informe preliminar, medios de comunicación institucional, expedientes físicos, hoja de cálculo</w:t>
+              <w:t>Informe preliminar, expedientes físicos, hoja de cálculo</w:t>
             </w:r>
           </w:p>
         </w:tc>

</xml_diff>